<commit_message>
chore: boost ATS score — add Freshservice, Jira, Agile, ITSM, SLOs, Configuration/Change Management
- Add Process & ITSM skills row: Agile/Scrum, Jira, Freshservice, ITSM, Change/Incident/Release Management
- Add Configuration Management to CI/CD & IaC skills
- Add SLOs to summary and current role bullet
- Add Freshservice and Agile to current role leadership bullet
- Add change management workflows to ISO/SOC 2 compliance bullet
- Tighten spacing to maintain single-page layout
- Update DOCX generator with matching changes
</commit_message>
<xml_diff>
--- a/public/files/Aniket_Kumar_DevOps_Resume.docx
+++ b/public/files/Aniket_Kumar_DevOps_Resume.docx
@@ -46,7 +46,7 @@
     </w:p>
     <w:p>
       <w:pPr>
-        <w:spacing w:before="100" w:after="40"/>
+        <w:spacing w:before="80" w:after="40"/>
         <w:pBdr>
           <w:bottom w:val="single" w:sz="6" w:space="1" w:color="1B3A5C"/>
         </w:pBdr>
@@ -70,12 +70,12 @@
           <w:rFonts w:ascii="Calibri" w:hAnsi="Calibri"/>
           <w:sz w:val="20"/>
         </w:rPr>
-        <w:t>Senior DevOps Engineer and acting technical lead with 4+ years of experience in high-availability infrastructure, CI/CD automation, Kubernetes orchestration, and production operations across multi-cloud and on-premise environments. Lead a team of 8+, driving incident management, root cause analysis, cloud migration strategies, and DevSecOps practices while sustaining 99.9% SLA across 15+ production applications. Full-stack development background with strong end-to-end troubleshooting skills; expertise in Infrastructure as Code, observability, database HA/DR, cost optimization, and security compliance (ISO 27001, SOC 2).</w:t>
+        <w:t>Senior DevOps Engineer and acting technical lead with 4+ years of experience in high-availability infrastructure, CI/CD automation, Kubernetes orchestration, and production operations across multi-cloud and on-premise environments. Lead a team of 8+, driving incident management, root cause analysis, cloud migration strategies, and DevSecOps practices while defining SLOs and sustaining 99.9% SLA across 15+ production applications. Full-stack development background with strong end-to-end troubleshooting skills; expertise in Infrastructure as Code, observability, database HA/DR, cost optimization, and security compliance (ISO 27001, SOC 2).</w:t>
       </w:r>
     </w:p>
     <w:p>
       <w:pPr>
-        <w:spacing w:before="100" w:after="40"/>
+        <w:spacing w:before="80" w:after="40"/>
         <w:pBdr>
           <w:bottom w:val="single" w:sz="6" w:space="1" w:color="1B3A5C"/>
         </w:pBdr>
@@ -127,7 +127,7 @@
           <w:rFonts w:ascii="Calibri" w:hAnsi="Calibri"/>
           <w:sz w:val="20"/>
         </w:rPr>
-        <w:t xml:space="preserve"> Docker, Kubernetes, Docker Compose, Jenkins, GitHub Actions, GitLab CI/CD, Terraform, Ansible, Grype</w:t>
+        <w:t xml:space="preserve"> Docker, Kubernetes, Docker Compose, Jenkins, GitHub Actions, GitLab CI/CD, Terraform, Ansible, Configuration Management, Grype</w:t>
       </w:r>
     </w:p>
     <w:p>
@@ -172,7 +172,27 @@
     </w:p>
     <w:p>
       <w:pPr>
-        <w:spacing w:before="100" w:after="40"/>
+        <w:spacing w:after="10" w:line="240" w:lineRule="exact"/>
+      </w:pPr>
+      <w:r>
+        <w:rPr>
+          <w:rFonts w:ascii="Calibri" w:hAnsi="Calibri"/>
+          <w:b/>
+          <w:sz w:val="20"/>
+        </w:rPr>
+        <w:t>Process &amp; ITSM:</w:t>
+      </w:r>
+      <w:r>
+        <w:rPr>
+          <w:rFonts w:ascii="Calibri" w:hAnsi="Calibri"/>
+          <w:sz w:val="20"/>
+        </w:rPr>
+        <w:t xml:space="preserve"> Agile/Scrum, Jira, Freshservice, ITSM, Change Management, Incident Management, Release Management</w:t>
+      </w:r>
+    </w:p>
+    <w:p>
+      <w:pPr>
+        <w:spacing w:before="80" w:after="40"/>
         <w:pBdr>
           <w:bottom w:val="single" w:sz="6" w:space="1" w:color="1B3A5C"/>
         </w:pBdr>
@@ -238,7 +258,7 @@
           <w:rFonts w:ascii="Calibri" w:hAnsi="Calibri"/>
           <w:sz w:val="20"/>
         </w:rPr>
-        <w:t>Serve as acting technical lead for 15+ production applications, mentoring 5+ engineers, leading root cause analysis, coordinating incident response, and managing sprint-level DevOps planning while sustaining 99.9% uptime SLA.</w:t>
+        <w:t>Serve as acting technical lead for 15+ production applications, mentoring 5+ engineers, leading root cause analysis, coordinating incident response via Freshservice, and driving Agile sprint planning while defining SLOs and sustaining 99.9% uptime SLA.</w:t>
       </w:r>
     </w:p>
     <w:p>
@@ -280,7 +300,7 @@
           <w:rFonts w:ascii="Calibri" w:hAnsi="Calibri"/>
           <w:sz w:val="20"/>
         </w:rPr>
-        <w:t>Supported ISO 27001 and SOC 2 audit processes by enforcing access controls, centralized logging, backup validation, and security policy compliance across cloud infrastructure.</w:t>
+        <w:t>Supported ISO 27001 and SOC 2 audit processes by enforcing access controls, change management workflows, centralized logging, backup validation, and security policy compliance across cloud infrastructure.</w:t>
       </w:r>
     </w:p>
     <w:p>
@@ -451,7 +471,7 @@
     </w:p>
     <w:p>
       <w:pPr>
-        <w:spacing w:before="100" w:after="40"/>
+        <w:spacing w:before="80" w:after="40"/>
         <w:pBdr>
           <w:bottom w:val="single" w:sz="6" w:space="1" w:color="1B3A5C"/>
         </w:pBdr>
@@ -508,7 +528,7 @@
     </w:p>
     <w:sectPr>
       <w:pgSz w:w="12240" w:h="15840"/>
-      <w:pgMar w:top="648" w:right="792" w:bottom="648" w:left="792" w:header="720" w:footer="720" w:gutter="0"/>
+      <w:pgMar w:top="605" w:right="792" w:bottom="605" w:left="792" w:header="720" w:footer="720" w:gutter="0"/>
       <w:cols w:space="720"/>
       <w:docGrid w:linePitch="360"/>
     </w:sectPr>

</xml_diff>

<commit_message>
resume: regenerate DOCX and PDF with updated content
</commit_message>
<xml_diff>
--- a/public/files/Aniket_Kumar_DevOps_Resume.docx
+++ b/public/files/Aniket_Kumar_DevOps_Resume.docx
@@ -27,7 +27,7 @@
           <w:color w:val="333333"/>
           <w:sz w:val="20"/>
         </w:rPr>
-        <w:t>Senior DevOps Engineer  |  Platform Engineering  |  Cloud Infrastructure  |  SRE</w:t>
+        <w:t>Senior DevOps Engineer  |  Technical Lead  |  Platform Engineering  |  SRE</w:t>
       </w:r>
     </w:p>
     <w:p>
@@ -41,7 +41,7 @@
           <w:color w:val="444444"/>
           <w:sz w:val="18"/>
         </w:rPr>
-        <w:t>Samastipur, Bihar, India  •  +91 9939093867  •  aniket.kumar@hotmail.com  •  linkedin.com/in/crypticani  •  github.com/crypticani  •  crypticani.dev</w:t>
+        <w:t>Open to Relocation | India  •  +91 9939093867  •  aniket.kumar@hotmail.com  •  linkedin.com/in/crypticani  •  github.com/crypticani  •  crypticani.dev</w:t>
       </w:r>
     </w:p>
     <w:p>
@@ -70,7 +70,7 @@
           <w:rFonts w:ascii="Calibri" w:hAnsi="Calibri"/>
           <w:sz w:val="20"/>
         </w:rPr>
-        <w:t>Senior DevOps Engineer and acting technical lead with 4+ years of experience in high-availability infrastructure, CI/CD automation, Kubernetes orchestration, and production operations across multi-cloud and on-premise environments. Lead a team of 8+, driving incident management, root cause analysis, cloud migration strategies, and DevSecOps practices while defining SLOs and sustaining 99.9% SLA across 15+ production applications. Full-stack development background with strong end-to-end troubleshooting skills; expertise in Infrastructure as Code, observability, database HA/DR, cost optimization, and security compliance (ISO 27001, SOC 2).</w:t>
+        <w:t>Senior DevOps Engineer and Technical Lead with 4+ years of experience in Platform Engineering, Kubernetes orchestration, CI/CD automation, and Reliability Engineering across multi-cloud and on-premise environments. Technical lead for a DevOps team of 8+ engineers while directly managing and mentoring 2–3 interns. Drove infrastructure decision-making, RCA ownership, incident coordination, and sprint planning while defining SLOs and sustaining 99.9% SLA across 15+ production applications. Skilled in Terraform-based Infrastructure as Code, observability, database HA/DR, cost optimization, and supported ISO 27001 and SOC 2 compliance initiatives.</w:t>
       </w:r>
     </w:p>
     <w:p>
@@ -258,7 +258,7 @@
           <w:rFonts w:ascii="Calibri" w:hAnsi="Calibri"/>
           <w:sz w:val="20"/>
         </w:rPr>
-        <w:t>Serve as acting technical lead for 15+ production applications, mentoring 5+ engineers, leading root cause analysis, coordinating incident response via Freshservice, and driving Agile sprint planning while defining SLOs and sustaining 99.9% uptime SLA.</w:t>
+        <w:t>Technical lead for a DevOps team of 8+ engineers while directly managing and mentoring 2–3 interns; drove task assignment, roster management, sprint coordination, technical guidance, incident coordination, and RCA ownership across 15+ production applications, sustaining 99.9% uptime SLA.</w:t>
       </w:r>
     </w:p>
     <w:p>
@@ -300,7 +300,21 @@
           <w:rFonts w:ascii="Calibri" w:hAnsi="Calibri"/>
           <w:sz w:val="20"/>
         </w:rPr>
-        <w:t>Supported ISO 27001 and SOC 2 audit processes by enforcing access controls, change management workflows, centralized logging, backup validation, and security policy compliance across cloud infrastructure.</w:t>
+        <w:t>Supported ISO 27001 and SOC 2 audit and compliance activities by enforcing access controls, change management workflows, centralized logging, backup validation, and security policy compliance across cloud infrastructure.</w:t>
+      </w:r>
+    </w:p>
+    <w:p>
+      <w:pPr>
+        <w:pStyle w:val="ListBullet"/>
+        <w:spacing w:before="0" w:after="10" w:line="240" w:lineRule="exact"/>
+        <w:ind w:left="360"/>
+      </w:pPr>
+      <w:r>
+        <w:rPr>
+          <w:rFonts w:ascii="Calibri" w:hAnsi="Calibri"/>
+          <w:sz w:val="20"/>
+        </w:rPr>
+        <w:t>Defined infrastructure standards, deployment patterns, operational runbooks, and platform best practices adopted across multiple application teams, improving deployment consistency and operational reliability.</w:t>
       </w:r>
     </w:p>
     <w:p>
@@ -411,7 +425,7 @@
           <w:rFonts w:ascii="Calibri" w:hAnsi="Calibri"/>
           <w:sz w:val="20"/>
         </w:rPr>
-        <w:t>Architected HA data platforms: PostgreSQL + Patroni, MySQL Group Replication, MongoDB Replica Sets, ClickHouse, Redis Sentinel, and KeyDB with automated backup, PITR, and failover runbooks.</w:t>
+        <w:t>Architected HA data platforms: PostgreSQL + Patroni, MySQL Group Replication, MongoDB Replica Sets, ClickHouse, Redis Sentinel, and KeyDB with automated backup, PITR, and production readiness runbooks.</w:t>
       </w:r>
     </w:p>
     <w:p>
@@ -425,7 +439,7 @@
           <w:rFonts w:ascii="Calibri" w:hAnsi="Calibri"/>
           <w:sz w:val="20"/>
         </w:rPr>
-        <w:t>Implemented disaster recovery with automated snapshots, cross-region backup replication, and documented recovery runbooks, achieving sub-30-minute RTO.</w:t>
+        <w:t>Implemented disaster recovery with automated snapshots, cross-region backup replication, and documented recovery runbooks, achieving sub-30-minute RTO and operational excellence standards.</w:t>
       </w:r>
     </w:p>
     <w:p>

</xml_diff>